<commit_message>
minor changes to TGD schedule
minor changes to TGD schedule
</commit_message>
<xml_diff>
--- a/grandDuke2026/The Grand Duke - RVCO - rehearsal schedule - Final.docx
+++ b/grandDuke2026/The Grand Duke - RVCO - rehearsal schedule - Final.docx
@@ -1285,25 +1285,7 @@
                 <w:sz w:val="20"/>
                 <w:szCs w:val="20"/>
               </w:rPr>
-              <w:t>9:30-10</w:t>
-            </w:r>
-            <w:r>
-              <w:rPr>
-                <w:b/>
-                <w:bCs/>
-                <w:sz w:val="20"/>
-                <w:szCs w:val="20"/>
-              </w:rPr>
-              <w:t>:</w:t>
-            </w:r>
-            <w:r>
-              <w:rPr>
-                <w:b/>
-                <w:bCs/>
-                <w:sz w:val="20"/>
-                <w:szCs w:val="20"/>
-              </w:rPr>
-              <w:t>00</w:t>
+              <w:t>9:30-1000</w:t>
             </w:r>
           </w:p>
           <w:p>
@@ -2578,79 +2560,225 @@
                 <w:sz w:val="20"/>
                 <w:szCs w:val="20"/>
               </w:rPr>
+              <w:t xml:space="preserve">#5 </w:t>
+            </w:r>
+            <w:r>
+              <w:rPr>
+                <w:sz w:val="20"/>
+                <w:szCs w:val="20"/>
+              </w:rPr>
+              <w:t xml:space="preserve">pp. </w:t>
+            </w:r>
+            <w:r>
+              <w:rPr>
+                <w:sz w:val="20"/>
+                <w:szCs w:val="20"/>
+              </w:rPr>
+              <w:t>65-66</w:t>
+            </w:r>
+          </w:p>
+          <w:p>
+            <w:pPr>
+              <w:rPr>
+                <w:sz w:val="20"/>
+                <w:szCs w:val="20"/>
+              </w:rPr>
+            </w:pPr>
+          </w:p>
+          <w:p>
+            <w:pPr>
+              <w:rPr>
+                <w:b/>
+                <w:sz w:val="20"/>
+                <w:szCs w:val="20"/>
+              </w:rPr>
+            </w:pPr>
+            <w:r>
+              <w:rPr>
+                <w:b/>
+                <w:sz w:val="20"/>
+                <w:szCs w:val="20"/>
+              </w:rPr>
+              <w:t>2:15-3:00</w:t>
+            </w:r>
+          </w:p>
+          <w:p>
+            <w:pPr>
+              <w:rPr>
+                <w:sz w:val="20"/>
+                <w:szCs w:val="20"/>
+              </w:rPr>
+            </w:pPr>
+            <w:r>
+              <w:rPr>
+                <w:bCs/>
+                <w:sz w:val="20"/>
+                <w:szCs w:val="20"/>
+              </w:rPr>
+              <w:t>Rudolph</w:t>
+            </w:r>
+          </w:p>
+          <w:p>
+            <w:pPr>
+              <w:rPr>
+                <w:sz w:val="20"/>
+                <w:szCs w:val="20"/>
+              </w:rPr>
+            </w:pPr>
+            <w:r>
+              <w:rPr>
+                <w:sz w:val="20"/>
+                <w:szCs w:val="20"/>
+              </w:rPr>
               <w:t>#</w:t>
             </w:r>
-            <w:proofErr w:type="gramStart"/>
-            <w:r>
-              <w:rPr>
-                <w:sz w:val="20"/>
-                <w:szCs w:val="20"/>
-              </w:rPr>
-              <w:t xml:space="preserve">5  </w:t>
-            </w:r>
-            <w:r>
-              <w:rPr>
-                <w:sz w:val="20"/>
-                <w:szCs w:val="20"/>
-              </w:rPr>
-              <w:t>pp.</w:t>
-            </w:r>
-            <w:proofErr w:type="gramEnd"/>
-            <w:r>
-              <w:rPr>
+            <w:r>
+              <w:rPr>
+                <w:sz w:val="20"/>
+                <w:szCs w:val="20"/>
+              </w:rPr>
+              <w:t xml:space="preserve">9a, </w:t>
+            </w:r>
+            <w:r>
+              <w:rPr>
+                <w:sz w:val="20"/>
+                <w:szCs w:val="20"/>
+              </w:rPr>
+              <w:t>#1</w:t>
+            </w:r>
+            <w:r>
+              <w:rPr>
+                <w:sz w:val="20"/>
+                <w:szCs w:val="20"/>
+              </w:rPr>
+              <w:t>1,</w:t>
+            </w:r>
+            <w:r>
+              <w:rPr>
+                <w:sz w:val="20"/>
+                <w:szCs w:val="20"/>
+              </w:rPr>
+              <w:t xml:space="preserve"> #</w:t>
+            </w:r>
+            <w:r>
+              <w:rPr>
+                <w:sz w:val="20"/>
+                <w:szCs w:val="20"/>
+              </w:rPr>
+              <w:t>28a</w:t>
+            </w:r>
+          </w:p>
+          <w:p>
+            <w:pPr>
+              <w:rPr>
+                <w:bCs/>
+                <w:sz w:val="20"/>
+                <w:szCs w:val="20"/>
+              </w:rPr>
+            </w:pPr>
+          </w:p>
+          <w:p>
+            <w:pPr>
+              <w:rPr>
+                <w:bCs/>
+                <w:sz w:val="20"/>
+                <w:szCs w:val="20"/>
+              </w:rPr>
+            </w:pPr>
+          </w:p>
+          <w:p>
+            <w:pPr>
+              <w:rPr>
+                <w:b/>
+                <w:sz w:val="20"/>
+                <w:szCs w:val="20"/>
+              </w:rPr>
+            </w:pPr>
+            <w:r>
+              <w:rPr>
+                <w:b/>
+                <w:sz w:val="20"/>
+                <w:szCs w:val="20"/>
+              </w:rPr>
+              <w:t>3:00-4:00</w:t>
+            </w:r>
+          </w:p>
+          <w:p>
+            <w:pPr>
+              <w:rPr>
+                <w:sz w:val="20"/>
+                <w:szCs w:val="20"/>
+              </w:rPr>
+            </w:pPr>
+            <w:r>
+              <w:rPr>
+                <w:sz w:val="20"/>
+                <w:szCs w:val="20"/>
+              </w:rPr>
+              <w:t>Ludwig, Lisa</w:t>
+            </w:r>
+          </w:p>
+          <w:p>
+            <w:pPr>
+              <w:rPr>
+                <w:sz w:val="20"/>
+                <w:szCs w:val="20"/>
+              </w:rPr>
+            </w:pPr>
+            <w:r>
+              <w:rPr>
+                <w:sz w:val="20"/>
+                <w:szCs w:val="20"/>
+              </w:rPr>
+              <w:t>#</w:t>
+            </w:r>
+            <w:r>
+              <w:rPr>
+                <w:sz w:val="20"/>
+                <w:szCs w:val="20"/>
+              </w:rPr>
+              <w:t>1a</w:t>
+            </w:r>
+            <w:r>
+              <w:rPr>
+                <w:sz w:val="20"/>
+                <w:szCs w:val="20"/>
+              </w:rPr>
+              <w:t>, #15</w:t>
+            </w:r>
+          </w:p>
+          <w:p>
+            <w:pPr>
+              <w:rPr>
+                <w:bCs/>
+                <w:sz w:val="20"/>
+                <w:szCs w:val="20"/>
+              </w:rPr>
+            </w:pPr>
+          </w:p>
+          <w:p>
+            <w:pPr>
+              <w:rPr>
+                <w:i/>
+                <w:sz w:val="20"/>
+                <w:szCs w:val="20"/>
+              </w:rPr>
+            </w:pPr>
+            <w:r>
+              <w:rPr>
+                <w:sz w:val="20"/>
+                <w:szCs w:val="20"/>
+              </w:rPr>
+              <w:t>Ludwig</w:t>
+            </w:r>
+            <w:r>
+              <w:rPr>
+                <w:bCs/>
                 <w:sz w:val="20"/>
                 <w:szCs w:val="20"/>
               </w:rPr>
               <w:t xml:space="preserve"> </w:t>
             </w:r>
-            <w:r>
-              <w:rPr>
-                <w:sz w:val="20"/>
-                <w:szCs w:val="20"/>
-              </w:rPr>
-              <w:t>65-66</w:t>
-            </w:r>
-          </w:p>
-          <w:p>
-            <w:pPr>
-              <w:rPr>
-                <w:sz w:val="20"/>
-                <w:szCs w:val="20"/>
-              </w:rPr>
-            </w:pPr>
-          </w:p>
-          <w:p>
-            <w:pPr>
-              <w:rPr>
-                <w:b/>
-                <w:sz w:val="20"/>
-                <w:szCs w:val="20"/>
-              </w:rPr>
-            </w:pPr>
-            <w:r>
-              <w:rPr>
-                <w:b/>
-                <w:sz w:val="20"/>
-                <w:szCs w:val="20"/>
-              </w:rPr>
-              <w:t>2:15-3:00</w:t>
-            </w:r>
-          </w:p>
-          <w:p>
-            <w:pPr>
-              <w:rPr>
-                <w:sz w:val="20"/>
-                <w:szCs w:val="20"/>
-              </w:rPr>
-            </w:pPr>
-            <w:r>
-              <w:rPr>
-                <w:bCs/>
-                <w:sz w:val="20"/>
-                <w:szCs w:val="20"/>
-              </w:rPr>
-              <w:t>Rudolph</w:t>
-            </w:r>
           </w:p>
           <w:p>
             <w:pPr>
@@ -2671,95 +2799,8 @@
                 <w:sz w:val="20"/>
                 <w:szCs w:val="20"/>
               </w:rPr>
-              <w:t xml:space="preserve">9a, </w:t>
-            </w:r>
-            <w:r>
-              <w:rPr>
-                <w:sz w:val="20"/>
-                <w:szCs w:val="20"/>
-              </w:rPr>
-              <w:t>#1</w:t>
-            </w:r>
-            <w:r>
-              <w:rPr>
-                <w:sz w:val="20"/>
-                <w:szCs w:val="20"/>
-              </w:rPr>
-              <w:t>1,</w:t>
-            </w:r>
-            <w:r>
-              <w:rPr>
-                <w:sz w:val="20"/>
-                <w:szCs w:val="20"/>
-              </w:rPr>
-              <w:t xml:space="preserve"> #</w:t>
-            </w:r>
-            <w:r>
-              <w:rPr>
-                <w:sz w:val="20"/>
-                <w:szCs w:val="20"/>
-              </w:rPr>
-              <w:t>28a</w:t>
-            </w:r>
-          </w:p>
-          <w:p>
-            <w:pPr>
-              <w:rPr>
-                <w:bCs/>
-                <w:sz w:val="20"/>
-                <w:szCs w:val="20"/>
-              </w:rPr>
-            </w:pPr>
-          </w:p>
-          <w:p>
-            <w:pPr>
-              <w:rPr>
-                <w:bCs/>
-                <w:sz w:val="20"/>
-                <w:szCs w:val="20"/>
-              </w:rPr>
-            </w:pPr>
-          </w:p>
-          <w:p>
-            <w:pPr>
-              <w:rPr>
-                <w:b/>
-                <w:sz w:val="20"/>
-                <w:szCs w:val="20"/>
-              </w:rPr>
-            </w:pPr>
-            <w:r>
-              <w:rPr>
-                <w:b/>
-                <w:sz w:val="20"/>
-                <w:szCs w:val="20"/>
-              </w:rPr>
-              <w:t>3:00-4:00</w:t>
-            </w:r>
-          </w:p>
-          <w:p>
-            <w:pPr>
-              <w:rPr>
-                <w:sz w:val="20"/>
-                <w:szCs w:val="20"/>
-              </w:rPr>
-            </w:pPr>
-            <w:r>
-              <w:rPr>
-                <w:sz w:val="20"/>
-                <w:szCs w:val="20"/>
-              </w:rPr>
-              <w:t>Ludwig, Lisa</w:t>
-            </w:r>
-          </w:p>
-          <w:p>
-            <w:pPr>
-              <w:rPr>
-                <w:bCs/>
-                <w:sz w:val="20"/>
-                <w:szCs w:val="20"/>
-              </w:rPr>
-            </w:pPr>
+              <w:t xml:space="preserve">2, </w:t>
+            </w:r>
             <w:r>
               <w:rPr>
                 <w:sz w:val="20"/>
@@ -2772,40 +2813,8 @@
                 <w:sz w:val="20"/>
                 <w:szCs w:val="20"/>
               </w:rPr>
-              <w:t>1a</w:t>
-            </w:r>
-          </w:p>
-          <w:p>
-            <w:pPr>
-              <w:rPr>
-                <w:i/>
-                <w:sz w:val="20"/>
-                <w:szCs w:val="20"/>
-              </w:rPr>
-            </w:pPr>
-            <w:r>
-              <w:rPr>
-                <w:sz w:val="20"/>
-                <w:szCs w:val="20"/>
-              </w:rPr>
-              <w:t>Ludwig</w:t>
-            </w:r>
-            <w:r>
-              <w:rPr>
-                <w:bCs/>
-                <w:sz w:val="20"/>
-                <w:szCs w:val="20"/>
-              </w:rPr>
-              <w:t xml:space="preserve"> </w:t>
-            </w:r>
-          </w:p>
-          <w:p>
-            <w:pPr>
-              <w:rPr>
-                <w:sz w:val="20"/>
-                <w:szCs w:val="20"/>
-              </w:rPr>
-            </w:pPr>
+              <w:t xml:space="preserve">5, </w:t>
+            </w:r>
             <w:r>
               <w:rPr>
                 <w:sz w:val="20"/>
@@ -2818,49 +2827,7 @@
                 <w:sz w:val="20"/>
                 <w:szCs w:val="20"/>
               </w:rPr>
-              <w:t xml:space="preserve">2, </w:t>
-            </w:r>
-            <w:r>
-              <w:rPr>
-                <w:sz w:val="20"/>
-                <w:szCs w:val="20"/>
-              </w:rPr>
-              <w:t>#</w:t>
-            </w:r>
-            <w:r>
-              <w:rPr>
-                <w:sz w:val="20"/>
-                <w:szCs w:val="20"/>
-              </w:rPr>
-              <w:t xml:space="preserve">5, </w:t>
-            </w:r>
-            <w:r>
-              <w:rPr>
-                <w:sz w:val="20"/>
-                <w:szCs w:val="20"/>
-              </w:rPr>
-              <w:t>#</w:t>
-            </w:r>
-            <w:r>
-              <w:rPr>
-                <w:sz w:val="20"/>
-                <w:szCs w:val="20"/>
-              </w:rPr>
               <w:t xml:space="preserve">14, </w:t>
-            </w:r>
-            <w:r>
-              <w:rPr>
-                <w:sz w:val="20"/>
-                <w:szCs w:val="20"/>
-              </w:rPr>
-              <w:t>#</w:t>
-            </w:r>
-            <w:r>
-              <w:rPr>
-                <w:sz w:val="20"/>
-                <w:szCs w:val="20"/>
-              </w:rPr>
-              <w:t xml:space="preserve">15, </w:t>
             </w:r>
             <w:r>
               <w:rPr>
@@ -7143,7 +7110,14 @@
                 <w:sz w:val="20"/>
                 <w:szCs w:val="20"/>
               </w:rPr>
-              <w:t>Rudolph</w:t>
+              <w:t>Rudol</w:t>
+            </w:r>
+            <w:r>
+              <w:rPr>
+                <w:sz w:val="20"/>
+                <w:szCs w:val="20"/>
+              </w:rPr>
+              <w:t>ph</w:t>
             </w:r>
             <w:r>
               <w:rPr>
@@ -10587,14 +10561,14 @@
                 <w:sz w:val="20"/>
                 <w:szCs w:val="20"/>
               </w:rPr>
-              <w:t xml:space="preserve">Chamberlains &amp; </w:t>
-            </w:r>
-            <w:r>
-              <w:rPr>
-                <w:sz w:val="20"/>
-                <w:szCs w:val="20"/>
-              </w:rPr>
-              <w:t>Rudolph</w:t>
+              <w:t>Chamberlains &amp; Rudol</w:t>
+            </w:r>
+            <w:r>
+              <w:rPr>
+                <w:sz w:val="20"/>
+                <w:szCs w:val="20"/>
+              </w:rPr>
+              <w:t>ph</w:t>
             </w:r>
           </w:p>
           <w:p>
@@ -11271,7 +11245,21 @@
                 <w:sz w:val="20"/>
                 <w:szCs w:val="20"/>
               </w:rPr>
+              <w:t>[</w:t>
+            </w:r>
+            <w:r>
+              <w:rPr>
+                <w:sz w:val="20"/>
+                <w:szCs w:val="20"/>
+              </w:rPr>
               <w:t>Julia</w:t>
+            </w:r>
+            <w:r>
+              <w:rPr>
+                <w:sz w:val="20"/>
+                <w:szCs w:val="20"/>
+              </w:rPr>
+              <w:t>]</w:t>
             </w:r>
           </w:p>
           <w:p>
@@ -11515,16 +11503,8 @@
                 <w:sz w:val="20"/>
                 <w:szCs w:val="20"/>
               </w:rPr>
-              <w:t>#17</w:t>
-            </w:r>
-          </w:p>
-          <w:p>
-            <w:pPr>
-              <w:rPr>
-                <w:sz w:val="20"/>
-                <w:szCs w:val="20"/>
-              </w:rPr>
-            </w:pPr>
+              <w:t xml:space="preserve">#17 </w:t>
+            </w:r>
           </w:p>
           <w:p>
             <w:pPr>
@@ -14442,13 +14422,6 @@
                 <w:szCs w:val="20"/>
               </w:rPr>
             </w:pPr>
-            <w:r>
-              <w:rPr>
-                <w:sz w:val="20"/>
-                <w:szCs w:val="20"/>
-              </w:rPr>
-              <w:t>#</w:t>
-            </w:r>
             <w:r>
               <w:rPr>
                 <w:sz w:val="20"/>

</xml_diff>